<commit_message>
Populate blank headings, reorder UI sections to match Index, relocate List of Abbreviations, and update TOC/LOF/LOT tables
</commit_message>
<xml_diff>
--- a/Port Digital Clearance System for NMPA Mangaluru_Project_Report.docx
+++ b/Port Digital Clearance System for NMPA Mangaluru_Project_Report.docx
@@ -2153,7 +2153,7 @@
               <w:jc w:val="right"/>
             </w:pPr>
             <w:r>
-              <w:t>38</w:t>
+              <w:t>36</w:t>
             </w:r>
           </w:p>
         </w:tc>
@@ -2197,7 +2197,7 @@
               <w:jc w:val="right"/>
             </w:pPr>
             <w:r>
-              <w:t>36</w:t>
+              <w:t>38</w:t>
             </w:r>
           </w:p>
         </w:tc>
@@ -2605,7 +2605,7 @@
               <w:jc w:val="right"/>
             </w:pPr>
             <w:r>
-              <w:t>47</w:t>
+              <w:t>46</w:t>
             </w:r>
           </w:p>
         </w:tc>
@@ -2649,7 +2649,7 @@
               <w:jc w:val="right"/>
             </w:pPr>
             <w:r>
-              <w:t>47</w:t>
+              <w:t>46</w:t>
             </w:r>
           </w:p>
         </w:tc>
@@ -3370,7 +3370,7 @@
                 <w:rFonts w:cs="Times New Roman"/>
                 <w:b/>
               </w:rPr>
-              <w:t>Figure 6.5: Clearance Request Form / Vessel Registry Interface</w:t>
+              <w:t>Figure 6.8: Admin Panel Console Interface</w:t>
             </w:r>
           </w:p>
         </w:tc>
@@ -3427,7 +3427,7 @@
                 <w:rFonts w:cs="Times New Roman"/>
                 <w:b/>
               </w:rPr>
-              <w:t>Figure 6.7: Department Approval Interface</w:t>
+              <w:t>Figure 6.7: Audit Logs Interface</w:t>
             </w:r>
           </w:p>
         </w:tc>
@@ -3455,7 +3455,7 @@
                 <w:rFonts w:cs="Times New Roman"/>
                 <w:b/>
               </w:rPr>
-              <w:t>38</w:t>
+              <w:t>37</w:t>
             </w:r>
           </w:p>
         </w:tc>
@@ -3484,7 +3484,7 @@
                 <w:rFonts w:cs="Times New Roman"/>
                 <w:b/>
               </w:rPr>
-              <w:t>Figure 6.8: Admin Panel Console Interface</w:t>
+              <w:t>Figure 6.5: Clearance Request Form / Vessel Registry Interface</w:t>
             </w:r>
           </w:p>
         </w:tc>
@@ -3541,7 +3541,7 @@
                 <w:rFonts w:cs="Times New Roman"/>
                 <w:b/>
               </w:rPr>
-              <w:t>Figure 6.7: Audit Logs Interface</w:t>
+              <w:t>Figure 6.7: Department Approval Interface</w:t>
             </w:r>
           </w:p>
         </w:tc>
@@ -3996,7 +3996,7 @@
                 <w:rFonts w:cs="Times New Roman"/>
                 <w:b/>
               </w:rPr>
-              <w:t>42</w:t>
+              <w:t>41</w:t>
             </w:r>
           </w:p>
         </w:tc>
@@ -4775,7 +4775,7 @@
           <w:noProof/>
         </w:rPr>
         <w:drawing>
-          <wp:inline distT="0" distB="0" distL="0" distR="0" wp14:anchorId="67E63F92" wp14:editId="0721C19F">
+          <wp:inline distT="0" distB="0" distL="0" distR="0" wp14:anchorId="7E635614" wp14:editId="43EA414B">
             <wp:extent cx="5410200" cy="3480793"/>
             <wp:effectExtent l="0" t="0" r="0" b="5715"/>
             <wp:docPr id="1240265402" name="Picture 1"/>
@@ -7442,7 +7442,7 @@
           <w:noProof/>
         </w:rPr>
         <w:drawing>
-          <wp:inline distT="0" distB="0" distL="0" distR="0" wp14:anchorId="350DB4B9" wp14:editId="69DAED61">
+          <wp:inline distT="0" distB="0" distL="0" distR="0" wp14:anchorId="0CD7A6C0" wp14:editId="4824D8AF">
             <wp:extent cx="5943600" cy="3823970"/>
             <wp:effectExtent l="0" t="0" r="0" b="5080"/>
             <wp:docPr id="612872577" name="Picture 1"/>
@@ -11779,7 +11779,7 @@
           <w:noProof/>
         </w:rPr>
         <w:drawing>
-          <wp:inline distT="0" distB="0" distL="0" distR="0" wp14:anchorId="0ED189B8" wp14:editId="179D0567">
+          <wp:inline distT="0" distB="0" distL="0" distR="0" wp14:anchorId="48998F9C" wp14:editId="46272BF0">
             <wp:extent cx="5303520" cy="3431689"/>
             <wp:effectExtent l="0" t="0" r="0" b="0"/>
             <wp:docPr id="3" name="Picture 3"/>
@@ -13288,7 +13288,7 @@
         </w:rPr>
         <w:lastRenderedPageBreak/>
         <w:drawing>
-          <wp:inline distT="0" distB="0" distL="0" distR="0" wp14:anchorId="7DE504AD" wp14:editId="55F14CE5">
+          <wp:inline distT="0" distB="0" distL="0" distR="0" wp14:anchorId="67CD6EFA" wp14:editId="4F275006">
             <wp:extent cx="3657600" cy="3657600"/>
             <wp:effectExtent l="0" t="0" r="0" b="0"/>
             <wp:docPr id="10" name="Picture 10"/>
@@ -13377,7 +13377,7 @@
         </w:rPr>
         <w:lastRenderedPageBreak/>
         <w:drawing>
-          <wp:inline distT="0" distB="0" distL="0" distR="0" wp14:anchorId="251FC456" wp14:editId="4EBBD43C">
+          <wp:inline distT="0" distB="0" distL="0" distR="0" wp14:anchorId="3235E2E7" wp14:editId="584E80E6">
             <wp:extent cx="3657600" cy="3657600"/>
             <wp:effectExtent l="0" t="0" r="0" b="0"/>
             <wp:docPr id="11" name="Picture 11"/>
@@ -13505,7 +13505,7 @@
         </w:rPr>
         <w:lastRenderedPageBreak/>
         <w:drawing>
-          <wp:inline distT="0" distB="0" distL="0" distR="0" wp14:anchorId="16C9D618" wp14:editId="58271775">
+          <wp:inline distT="0" distB="0" distL="0" distR="0" wp14:anchorId="56B3CE3F" wp14:editId="4AFC26CB">
             <wp:extent cx="3657600" cy="3657600"/>
             <wp:effectExtent l="0" t="0" r="0" b="0"/>
             <wp:docPr id="12" name="Picture 12"/>
@@ -13633,7 +13633,7 @@
         </w:rPr>
         <w:lastRenderedPageBreak/>
         <w:drawing>
-          <wp:inline distT="0" distB="0" distL="0" distR="0" wp14:anchorId="6EBBBAF1" wp14:editId="32FFAEC8">
+          <wp:inline distT="0" distB="0" distL="0" distR="0" wp14:anchorId="466926C4" wp14:editId="4B01120E">
             <wp:extent cx="3657600" cy="3657600"/>
             <wp:effectExtent l="0" t="0" r="0" b="0"/>
             <wp:docPr id="13" name="Picture 13"/>
@@ -13825,7 +13825,7 @@
           <w:noProof/>
         </w:rPr>
         <w:drawing>
-          <wp:inline distT="0" distB="0" distL="0" distR="0" wp14:anchorId="15E0F29E" wp14:editId="71C86792">
+          <wp:inline distT="0" distB="0" distL="0" distR="0" wp14:anchorId="031E8FA9" wp14:editId="467A0170">
             <wp:extent cx="5303520" cy="3314700"/>
             <wp:effectExtent l="0" t="0" r="0" b="0"/>
             <wp:docPr id="4" name="Picture 4"/>
@@ -13958,7 +13958,7 @@
         </w:rPr>
         <w:lastRenderedPageBreak/>
         <w:drawing>
-          <wp:inline distT="0" distB="0" distL="0" distR="0" wp14:anchorId="303A3384" wp14:editId="43D722F3">
+          <wp:inline distT="0" distB="0" distL="0" distR="0" wp14:anchorId="519604A0" wp14:editId="033C3DED">
             <wp:extent cx="5303520" cy="3314700"/>
             <wp:effectExtent l="0" t="0" r="0" b="0"/>
             <wp:docPr id="5" name="Picture 5"/>
@@ -14119,7 +14119,7 @@
         </w:rPr>
         <w:lastRenderedPageBreak/>
         <w:drawing>
-          <wp:inline distT="0" distB="0" distL="0" distR="0" wp14:anchorId="2F648F82" wp14:editId="3FE22FCA">
+          <wp:inline distT="0" distB="0" distL="0" distR="0" wp14:anchorId="392071BC" wp14:editId="2CB7FB76">
             <wp:extent cx="1320800" cy="4445493"/>
             <wp:effectExtent l="0" t="0" r="0" b="0"/>
             <wp:docPr id="1636429496" name="Picture 1"/>
@@ -14220,24 +14220,24 @@
     </w:p>
     <w:p>
       <w:pPr>
-        <w:keepNext/>
-        <w:spacing w:before="120" w:after="60"/>
+        <w:spacing w:line="276" w:lineRule="auto"/>
+        <w:jc w:val="both"/>
       </w:pPr>
       <w:r>
         <w:rPr>
           <w:b/>
           <w:sz w:val="28"/>
         </w:rPr>
-        <w:t>6.5 Vendor Screens</w:t>
-      </w:r>
-    </w:p>
-    <w:p>
-      <w:pPr>
-        <w:spacing w:line="276" w:lineRule="auto"/>
-        <w:jc w:val="both"/>
-      </w:pPr>
-      <w:r>
-        <w:t>The registration layout features field helpers and error prompts. If an agent enters an invalid or duplicate IMO number, the input field highlights in red and displays a warning message. Below is the screenshot of the Vessel Registry interface:</w:t>
+        <w:t>6.4 Administrator Screens</w:t>
+      </w:r>
+    </w:p>
+    <w:p>
+      <w:pPr>
+        <w:spacing w:line="276" w:lineRule="auto"/>
+        <w:jc w:val="both"/>
+      </w:pPr>
+      <w:r>
+        <w:t>The System Administrator Console allows managing the user roster, approving pending accounts, and toggling 2FA settings. Below is the screenshot of the Admin Panel Console:</w:t>
       </w:r>
     </w:p>
     <w:p>
@@ -14251,10 +14251,10 @@
         </w:rPr>
         <w:lastRenderedPageBreak/>
         <w:drawing>
-          <wp:inline distT="0" distB="0" distL="0" distR="0" wp14:anchorId="63502FBF" wp14:editId="1644AAA6">
+          <wp:inline distT="0" distB="0" distL="0" distR="0" wp14:anchorId="2936B742" wp14:editId="33212D34">
             <wp:extent cx="5303520" cy="3314700"/>
             <wp:effectExtent l="0" t="0" r="0" b="0"/>
-            <wp:docPr id="6" name="Picture 6"/>
+            <wp:docPr id="8" name="Picture 8"/>
             <wp:cNvGraphicFramePr>
               <a:graphicFrameLocks xmlns:a="http://schemas.openxmlformats.org/drawingml/2006/main" noChangeAspect="1"/>
             </wp:cNvGraphicFramePr>
@@ -14262,7 +14262,7 @@
               <a:graphicData uri="http://schemas.openxmlformats.org/drawingml/2006/picture">
                 <pic:pic xmlns:pic="http://schemas.openxmlformats.org/drawingml/2006/picture">
                   <pic:nvPicPr>
-                    <pic:cNvPr id="0" name="image_5.png"/>
+                    <pic:cNvPr id="0" name="image_7.png"/>
                     <pic:cNvPicPr/>
                   </pic:nvPicPr>
                   <pic:blipFill>
@@ -14303,7 +14303,7 @@
           <w:i/>
           <w:sz w:val="20"/>
         </w:rPr>
-        <w:t>Figure 6.</w:t>
+        <w:t xml:space="preserve">Figure </w:t>
       </w:r>
       <w:r>
         <w:rPr>
@@ -14312,7 +14312,7 @@
           <w:i/>
           <w:sz w:val="20"/>
         </w:rPr>
-        <w:t>5</w:t>
+        <w:t>6.8</w:t>
       </w:r>
       <w:r>
         <w:rPr>
@@ -14321,87 +14321,16 @@
           <w:i/>
           <w:sz w:val="20"/>
         </w:rPr>
-        <w:t>: Clearance Request Form / Vessel Registry Interface</w:t>
-      </w:r>
-    </w:p>
-    <w:p>
-      <w:pPr>
-        <w:spacing w:line="276" w:lineRule="auto"/>
-        <w:jc w:val="both"/>
-      </w:pPr>
-      <w:r>
-        <w:t>Real-time validation helpers check IMO 7-digit numeric checksums as shipping agents type, preventing invalid data submissions.</w:t>
-      </w:r>
-    </w:p>
-    <w:p>
-      <w:pPr>
-        <w:spacing w:line="276" w:lineRule="auto"/>
-        <w:jc w:val="both"/>
-      </w:pPr>
-      <w:r>
-        <w:t>Validation</w:t>
-      </w:r>
-    </w:p>
-    <w:p>
-      <w:pPr>
-        <w:spacing w:line="276" w:lineRule="auto"/>
-        <w:jc w:val="both"/>
-      </w:pPr>
-      <w:r>
-        <w:t>Client-side validation rules enforce required fields, 7-digit IMO patterns, positive tonnage values, valid email formats, and 6-digit TOTP passcode lengths prior to dispatches.</w:t>
-      </w:r>
-    </w:p>
-    <w:p>
-      <w:pPr>
-        <w:spacing w:line="276" w:lineRule="auto"/>
-        <w:jc w:val="both"/>
-      </w:pPr>
-      <w:r>
-        <w:t>Visual error prompts and red input borders provide immediate sensory feedback to operators when data constraints are violated.</w:t>
-      </w:r>
-    </w:p>
-    <w:p>
-      <w:pPr>
-        <w:spacing w:line="276" w:lineRule="auto"/>
-        <w:jc w:val="both"/>
-      </w:pPr>
-      <w:r>
-        <w:t>Validation</w:t>
-      </w:r>
-    </w:p>
-    <w:p>
-      <w:pPr>
-        <w:spacing w:line="276" w:lineRule="auto"/>
-        <w:jc w:val="both"/>
-      </w:pPr>
-    </w:p>
-    <w:p>
-      <w:pPr>
-        <w:spacing w:line="276" w:lineRule="auto"/>
-        <w:jc w:val="both"/>
-      </w:pPr>
-    </w:p>
-    <w:p>
-      <w:pPr>
-        <w:keepNext/>
-        <w:spacing w:before="360" w:line="276" w:lineRule="auto"/>
-        <w:jc w:val="both"/>
-        <w:rPr>
-          <w:b/>
-          <w:bCs/>
-        </w:rPr>
-      </w:pPr>
-      <w:r>
-        <w:t>View</w:t>
-      </w:r>
-    </w:p>
-    <w:p>
-      <w:pPr>
-        <w:spacing w:line="276" w:lineRule="auto"/>
-        <w:jc w:val="both"/>
-      </w:pPr>
-      <w:r>
-        <w:t>The Clearance Workflow page displays voyage applications in a table. Shipping agents can track their sequential review progress through PHO, Customs, and Traffic columns. Clearances are color-coded (green for approved, yellow for pending, red for rejected). Once fully approved, the row displays download buttons for the bilingual clearances. Below is the screenshot of the Clearance Workflow interface:</w:t>
+        <w:t>: Admin Panel Console Interface</w:t>
+      </w:r>
+    </w:p>
+    <w:p>
+      <w:pPr>
+        <w:spacing w:line="276" w:lineRule="auto"/>
+        <w:jc w:val="both"/>
+      </w:pPr>
+      <w:r>
+        <w:t>The Audit Logs Console displays a chronological history of security and configuration changes. Administrators and port managers can search, filter, and export the logs to a CSV file. Below is the screenshot of the Audit Logs interface:</w:t>
       </w:r>
     </w:p>
     <w:p>
@@ -14413,12 +14342,11 @@
         <w:rPr>
           <w:noProof/>
         </w:rPr>
-        <w:lastRenderedPageBreak/>
         <w:drawing>
-          <wp:inline distT="0" distB="0" distL="0" distR="0" wp14:anchorId="59E67B0E" wp14:editId="7A0BAFDC">
-            <wp:extent cx="5943600" cy="2712720"/>
+          <wp:inline distT="0" distB="0" distL="0" distR="0" wp14:anchorId="1ACFEFA5" wp14:editId="362958EB">
+            <wp:extent cx="5303520" cy="3314700"/>
             <wp:effectExtent l="0" t="0" r="0" b="0"/>
-            <wp:docPr id="1723561269" name="Picture 1"/>
+            <wp:docPr id="9" name="Picture 9"/>
             <wp:cNvGraphicFramePr>
               <a:graphicFrameLocks xmlns:a="http://schemas.openxmlformats.org/drawingml/2006/main" noChangeAspect="1"/>
             </wp:cNvGraphicFramePr>
@@ -14426,7 +14354,7 @@
               <a:graphicData uri="http://schemas.openxmlformats.org/drawingml/2006/picture">
                 <pic:pic xmlns:pic="http://schemas.openxmlformats.org/drawingml/2006/picture">
                   <pic:nvPicPr>
-                    <pic:cNvPr id="1723561269" name=""/>
+                    <pic:cNvPr id="0" name="image_8.png"/>
                     <pic:cNvPicPr/>
                   </pic:nvPicPr>
                   <pic:blipFill>
@@ -14438,7 +14366,7 @@
                   <pic:spPr>
                     <a:xfrm>
                       <a:off x="0" y="0"/>
-                      <a:ext cx="5943600" cy="2712720"/>
+                      <a:ext cx="5303520" cy="3314700"/>
                     </a:xfrm>
                     <a:prstGeom prst="rect">
                       <a:avLst/>
@@ -14467,92 +14395,123 @@
           <w:i/>
           <w:sz w:val="20"/>
         </w:rPr>
-        <w:t>Figure 6.</w:t>
-      </w:r>
-      <w:r>
+        <w:t>Figure 6.7: Audit Logs Interface</w:t>
+      </w:r>
+    </w:p>
+    <w:p>
+      <w:pPr>
+        <w:spacing w:line="276" w:lineRule="auto"/>
+        <w:jc w:val="both"/>
+      </w:pPr>
+      <w:r>
+        <w:lastRenderedPageBreak/>
+        <w:t>Searchable audit consoles enable port managers to filter security logs by user, date range, or event type, facilitating compliance audits.</w:t>
+      </w:r>
+    </w:p>
+    <w:p>
+      <w:pPr>
+        <w:keepNext/>
+        <w:spacing w:before="360" w:line="276" w:lineRule="auto"/>
+        <w:jc w:val="both"/>
         <w:rPr>
           <w:b/>
           <w:bCs/>
-          <w:i/>
-          <w:sz w:val="20"/>
         </w:rPr>
-        <w:t>7</w:t>
-      </w:r>
+      </w:pPr>
       <w:r>
         <w:rPr>
           <w:b/>
           <w:bCs/>
-          <w:i/>
-          <w:sz w:val="20"/>
         </w:rPr>
-        <w:t>: Department Approval Interface</w:t>
-      </w:r>
-    </w:p>
-    <w:p>
-      <w:pPr>
-        <w:spacing w:line="276" w:lineRule="auto"/>
-        <w:jc w:val="both"/>
-      </w:pPr>
-      <w:r>
-        <w:t>Color-coded badges provide immediate visual feedback regarding sequential approval status across Health, Customs, and Traffic columns.</w:t>
-      </w:r>
-    </w:p>
-    <w:p>
-      <w:pPr>
-        <w:spacing w:line="276" w:lineRule="auto"/>
-        <w:jc w:val="both"/>
-      </w:pPr>
-    </w:p>
-    <w:p>
-      <w:pPr>
-        <w:spacing w:line="276" w:lineRule="auto"/>
-        <w:jc w:val="both"/>
-      </w:pPr>
-    </w:p>
-    <w:p>
-      <w:pPr>
-        <w:spacing w:line="276" w:lineRule="auto"/>
-        <w:jc w:val="both"/>
-      </w:pPr>
-    </w:p>
-    <w:p>
-      <w:pPr>
-        <w:spacing w:line="276" w:lineRule="auto"/>
-        <w:jc w:val="both"/>
-      </w:pPr>
-      <w:r>
-        <w:br/>
-      </w:r>
-      <w:r>
-        <w:br/>
-      </w:r>
-    </w:p>
-    <w:p>
-      <w:pPr>
-        <w:spacing w:line="276" w:lineRule="auto"/>
-        <w:jc w:val="both"/>
-      </w:pPr>
-    </w:p>
-    <w:p>
-      <w:pPr>
-        <w:spacing w:line="276" w:lineRule="auto"/>
-        <w:jc w:val="both"/>
+        <w:t>Alerts</w:t>
+      </w:r>
+    </w:p>
+    <w:p>
+      <w:pPr>
+        <w:spacing w:line="276" w:lineRule="auto"/>
+        <w:jc w:val="both"/>
+      </w:pPr>
+      <w:r>
+        <w:t>System alerts include floating toast notifications for API success/failure messages, government SMS alert triggers for status updates, and audio indicators for urgent rejections.</w:t>
+      </w:r>
+    </w:p>
+    <w:p>
+      <w:pPr>
+        <w:spacing w:line="276" w:lineRule="auto"/>
+        <w:jc w:val="both"/>
+      </w:pPr>
+      <w:r>
+        <w:t>Asynchronous toast notifications alert shipping agents immediately when port health officers or customs checkers update clearance statuses.</w:t>
+      </w:r>
+    </w:p>
+    <w:p>
+      <w:pPr>
+        <w:keepNext/>
+        <w:spacing w:before="360" w:line="276" w:lineRule="auto"/>
+        <w:jc w:val="both"/>
+        <w:rPr>
+          <w:b/>
+          <w:bCs/>
+        </w:rPr>
+      </w:pPr>
+      <w:r>
+        <w:rPr>
+          <w:b/>
+          <w:bCs/>
+        </w:rPr>
+        <w:t>Error Messages</w:t>
+      </w:r>
+    </w:p>
+    <w:p>
+      <w:pPr>
+        <w:spacing w:line="276" w:lineRule="auto"/>
+        <w:jc w:val="both"/>
+      </w:pPr>
+      <w:r>
+        <w:t>Comprehensive modal error dialogs display descriptive rejection reasons, network failure fallback notifications, and session timeout auto-logout warnings.</w:t>
+      </w:r>
+    </w:p>
+    <w:p>
+      <w:pPr>
+        <w:spacing w:line="276" w:lineRule="auto"/>
+        <w:jc w:val="both"/>
+      </w:pPr>
+      <w:r>
+        <w:t>Descriptive error modals guide users on corrective actions when form submissions fail or network drops occur.</w:t>
+      </w:r>
+    </w:p>
+    <w:p>
+      <w:pPr>
+        <w:spacing w:line="276" w:lineRule="auto"/>
+        <w:jc w:val="both"/>
+      </w:pPr>
+    </w:p>
+    <w:p>
+      <w:pPr>
+        <w:spacing w:line="276" w:lineRule="auto"/>
+        <w:jc w:val="both"/>
+      </w:pPr>
+    </w:p>
+    <w:p>
+      <w:pPr>
+        <w:keepNext/>
+        <w:spacing w:before="120" w:after="60"/>
       </w:pPr>
       <w:r>
         <w:rPr>
           <w:b/>
           <w:sz w:val="28"/>
         </w:rPr>
-        <w:t>6.4 Administrator Screens</w:t>
-      </w:r>
-    </w:p>
-    <w:p>
-      <w:pPr>
-        <w:spacing w:line="276" w:lineRule="auto"/>
-        <w:jc w:val="both"/>
-      </w:pPr>
-      <w:r>
-        <w:t>The System Administrator Console allows managing the user roster, approving pending accounts, and toggling 2FA settings. Below is the screenshot of the Admin Panel Console:</w:t>
+        <w:t>6.5 Vendor Screens</w:t>
+      </w:r>
+    </w:p>
+    <w:p>
+      <w:pPr>
+        <w:spacing w:line="276" w:lineRule="auto"/>
+        <w:jc w:val="both"/>
+      </w:pPr>
+      <w:r>
+        <w:t>The registration layout features field helpers and error prompts. If an agent enters an invalid or duplicate IMO number, the input field highlights in red and displays a warning message. Below is the screenshot of the Vessel Registry interface:</w:t>
       </w:r>
     </w:p>
     <w:p>
@@ -14564,12 +14523,11 @@
         <w:rPr>
           <w:noProof/>
         </w:rPr>
-        <w:lastRenderedPageBreak/>
         <w:drawing>
-          <wp:inline distT="0" distB="0" distL="0" distR="0" wp14:anchorId="2D667AB7" wp14:editId="4F7E989E">
+          <wp:inline distT="0" distB="0" distL="0" distR="0" wp14:anchorId="6B451040" wp14:editId="538D6222">
             <wp:extent cx="5303520" cy="3314700"/>
             <wp:effectExtent l="0" t="0" r="0" b="0"/>
-            <wp:docPr id="8" name="Picture 8"/>
+            <wp:docPr id="6" name="Picture 6"/>
             <wp:cNvGraphicFramePr>
               <a:graphicFrameLocks xmlns:a="http://schemas.openxmlformats.org/drawingml/2006/main" noChangeAspect="1"/>
             </wp:cNvGraphicFramePr>
@@ -14577,7 +14535,7 @@
               <a:graphicData uri="http://schemas.openxmlformats.org/drawingml/2006/picture">
                 <pic:pic xmlns:pic="http://schemas.openxmlformats.org/drawingml/2006/picture">
                   <pic:nvPicPr>
-                    <pic:cNvPr id="0" name="image_7.png"/>
+                    <pic:cNvPr id="0" name="image_5.png"/>
                     <pic:cNvPicPr/>
                   </pic:nvPicPr>
                   <pic:blipFill>
@@ -14618,7 +14576,8 @@
           <w:i/>
           <w:sz w:val="20"/>
         </w:rPr>
-        <w:t xml:space="preserve">Figure </w:t>
+        <w:lastRenderedPageBreak/>
+        <w:t>Figure 6.</w:t>
       </w:r>
       <w:r>
         <w:rPr>
@@ -14627,7 +14586,7 @@
           <w:i/>
           <w:sz w:val="20"/>
         </w:rPr>
-        <w:t>6.8</w:t>
+        <w:t>5</w:t>
       </w:r>
       <w:r>
         <w:rPr>
@@ -14636,16 +14595,87 @@
           <w:i/>
           <w:sz w:val="20"/>
         </w:rPr>
-        <w:t>: Admin Panel Console Interface</w:t>
-      </w:r>
-    </w:p>
-    <w:p>
-      <w:pPr>
-        <w:spacing w:line="276" w:lineRule="auto"/>
-        <w:jc w:val="both"/>
-      </w:pPr>
-      <w:r>
-        <w:t>The Audit Logs Console displays a chronological history of security and configuration changes. Administrators and port managers can search, filter, and export the logs to a CSV file. Below is the screenshot of the Audit Logs interface:</w:t>
+        <w:t>: Clearance Request Form / Vessel Registry Interface</w:t>
+      </w:r>
+    </w:p>
+    <w:p>
+      <w:pPr>
+        <w:spacing w:line="276" w:lineRule="auto"/>
+        <w:jc w:val="both"/>
+      </w:pPr>
+      <w:r>
+        <w:t>Real-time validation helpers check IMO 7-digit numeric checksums as shipping agents type, preventing invalid data submissions.</w:t>
+      </w:r>
+    </w:p>
+    <w:p>
+      <w:pPr>
+        <w:spacing w:line="276" w:lineRule="auto"/>
+        <w:jc w:val="both"/>
+      </w:pPr>
+      <w:r>
+        <w:t>Validation</w:t>
+      </w:r>
+    </w:p>
+    <w:p>
+      <w:pPr>
+        <w:spacing w:line="276" w:lineRule="auto"/>
+        <w:jc w:val="both"/>
+      </w:pPr>
+      <w:r>
+        <w:t>Client-side validation rules enforce required fields, 7-digit IMO patterns, positive tonnage values, valid email formats, and 6-digit TOTP passcode lengths prior to dispatches.</w:t>
+      </w:r>
+    </w:p>
+    <w:p>
+      <w:pPr>
+        <w:spacing w:line="276" w:lineRule="auto"/>
+        <w:jc w:val="both"/>
+      </w:pPr>
+      <w:r>
+        <w:t>Visual error prompts and red input borders provide immediate sensory feedback to operators when data constraints are violated.</w:t>
+      </w:r>
+    </w:p>
+    <w:p>
+      <w:pPr>
+        <w:spacing w:line="276" w:lineRule="auto"/>
+        <w:jc w:val="both"/>
+      </w:pPr>
+      <w:r>
+        <w:t>Validation</w:t>
+      </w:r>
+    </w:p>
+    <w:p>
+      <w:pPr>
+        <w:spacing w:line="276" w:lineRule="auto"/>
+        <w:jc w:val="both"/>
+      </w:pPr>
+    </w:p>
+    <w:p>
+      <w:pPr>
+        <w:spacing w:line="276" w:lineRule="auto"/>
+        <w:jc w:val="both"/>
+      </w:pPr>
+    </w:p>
+    <w:p>
+      <w:pPr>
+        <w:keepNext/>
+        <w:spacing w:before="360" w:line="276" w:lineRule="auto"/>
+        <w:jc w:val="both"/>
+        <w:rPr>
+          <w:b/>
+          <w:bCs/>
+        </w:rPr>
+      </w:pPr>
+      <w:r>
+        <w:t>View</w:t>
+      </w:r>
+    </w:p>
+    <w:p>
+      <w:pPr>
+        <w:spacing w:line="276" w:lineRule="auto"/>
+        <w:jc w:val="both"/>
+      </w:pPr>
+      <w:r>
+        <w:t>The Clearance Workflow page displays voyage applications in a table. Shipping agents can track their sequential review progress through PHO, Customs, and Traffic columns. Clearances are color-coded (green for approved, yellow for pending, red for rejected). Once fully approved, the row displays download buttons for the bilingual clearances. Below is the screenshot of the Clearance Workflow interface:</w:t>
       </w:r>
     </w:p>
     <w:p>
@@ -14658,10 +14688,10 @@
           <w:noProof/>
         </w:rPr>
         <w:drawing>
-          <wp:inline distT="0" distB="0" distL="0" distR="0" wp14:anchorId="46B1D2F2" wp14:editId="2EF656D2">
-            <wp:extent cx="5303520" cy="3314700"/>
+          <wp:inline distT="0" distB="0" distL="0" distR="0" wp14:anchorId="71FA87FE" wp14:editId="33400CB7">
+            <wp:extent cx="5943600" cy="2712720"/>
             <wp:effectExtent l="0" t="0" r="0" b="0"/>
-            <wp:docPr id="9" name="Picture 9"/>
+            <wp:docPr id="1723561269" name="Picture 1"/>
             <wp:cNvGraphicFramePr>
               <a:graphicFrameLocks xmlns:a="http://schemas.openxmlformats.org/drawingml/2006/main" noChangeAspect="1"/>
             </wp:cNvGraphicFramePr>
@@ -14669,7 +14699,7 @@
               <a:graphicData uri="http://schemas.openxmlformats.org/drawingml/2006/picture">
                 <pic:pic xmlns:pic="http://schemas.openxmlformats.org/drawingml/2006/picture">
                   <pic:nvPicPr>
-                    <pic:cNvPr id="0" name="image_8.png"/>
+                    <pic:cNvPr id="1723561269" name=""/>
                     <pic:cNvPicPr/>
                   </pic:nvPicPr>
                   <pic:blipFill>
@@ -14681,7 +14711,7 @@
                   <pic:spPr>
                     <a:xfrm>
                       <a:off x="0" y="0"/>
-                      <a:ext cx="5303520" cy="3314700"/>
+                      <a:ext cx="5943600" cy="2712720"/>
                     </a:xfrm>
                     <a:prstGeom prst="rect">
                       <a:avLst/>
@@ -14710,96 +14740,65 @@
           <w:i/>
           <w:sz w:val="20"/>
         </w:rPr>
-        <w:t>Figure 6.7: Audit Logs Interface</w:t>
-      </w:r>
-    </w:p>
-    <w:p>
-      <w:pPr>
-        <w:spacing w:line="276" w:lineRule="auto"/>
-        <w:jc w:val="both"/>
-      </w:pPr>
-      <w:r>
-        <w:lastRenderedPageBreak/>
-        <w:t>Searchable audit consoles enable port managers to filter security logs by user, date range, or event type, facilitating compliance audits.</w:t>
-      </w:r>
-    </w:p>
-    <w:p>
-      <w:pPr>
-        <w:keepNext/>
-        <w:spacing w:before="360" w:line="276" w:lineRule="auto"/>
-        <w:jc w:val="both"/>
+        <w:t>Figure 6.</w:t>
+      </w:r>
+      <w:r>
         <w:rPr>
           <w:b/>
           <w:bCs/>
+          <w:i/>
+          <w:sz w:val="20"/>
         </w:rPr>
-      </w:pPr>
+        <w:t>7</w:t>
+      </w:r>
       <w:r>
         <w:rPr>
           <w:b/>
           <w:bCs/>
+          <w:i/>
+          <w:sz w:val="20"/>
         </w:rPr>
-        <w:t>Alerts</w:t>
-      </w:r>
-    </w:p>
-    <w:p>
-      <w:pPr>
-        <w:spacing w:line="276" w:lineRule="auto"/>
-        <w:jc w:val="both"/>
-      </w:pPr>
-      <w:r>
-        <w:t>System alerts include floating toast notifications for API success/failure messages, government SMS alert triggers for status updates, and audio indicators for urgent rejections.</w:t>
-      </w:r>
-    </w:p>
-    <w:p>
-      <w:pPr>
-        <w:spacing w:line="276" w:lineRule="auto"/>
-        <w:jc w:val="both"/>
-      </w:pPr>
-      <w:r>
-        <w:t>Asynchronous toast notifications alert shipping agents immediately when port health officers or customs checkers update clearance statuses.</w:t>
-      </w:r>
-    </w:p>
-    <w:p>
-      <w:pPr>
-        <w:keepNext/>
-        <w:spacing w:before="360" w:line="276" w:lineRule="auto"/>
-        <w:jc w:val="both"/>
-        <w:rPr>
-          <w:b/>
-          <w:bCs/>
-        </w:rPr>
-      </w:pPr>
-      <w:r>
-        <w:rPr>
-          <w:b/>
-          <w:bCs/>
-        </w:rPr>
-        <w:t>Error Messages</w:t>
-      </w:r>
-    </w:p>
-    <w:p>
-      <w:pPr>
-        <w:spacing w:line="276" w:lineRule="auto"/>
-        <w:jc w:val="both"/>
-      </w:pPr>
-      <w:r>
-        <w:t>Comprehensive modal error dialogs display descriptive rejection reasons, network failure fallback notifications, and session timeout auto-logout warnings.</w:t>
-      </w:r>
-    </w:p>
-    <w:p>
-      <w:pPr>
-        <w:spacing w:line="276" w:lineRule="auto"/>
-        <w:jc w:val="both"/>
-      </w:pPr>
-      <w:r>
-        <w:t>Descriptive error modals guide users on corrective actions when form submissions fail or network drops occur.</w:t>
-      </w:r>
-    </w:p>
-    <w:p>
-      <w:pPr>
-        <w:spacing w:line="276" w:lineRule="auto"/>
-        <w:jc w:val="both"/>
-      </w:pPr>
+        <w:t>: Department Approval Interface</w:t>
+      </w:r>
+    </w:p>
+    <w:p>
+      <w:pPr>
+        <w:spacing w:line="276" w:lineRule="auto"/>
+        <w:jc w:val="both"/>
+      </w:pPr>
+      <w:r>
+        <w:t>Color-coded badges provide immediate visual feedback regarding sequential approval status across Health, Customs, and Traffic columns.</w:t>
+      </w:r>
+    </w:p>
+    <w:p>
+      <w:pPr>
+        <w:spacing w:line="276" w:lineRule="auto"/>
+        <w:jc w:val="both"/>
+      </w:pPr>
+    </w:p>
+    <w:p>
+      <w:pPr>
+        <w:spacing w:line="276" w:lineRule="auto"/>
+        <w:jc w:val="both"/>
+      </w:pPr>
+    </w:p>
+    <w:p>
+      <w:pPr>
+        <w:spacing w:line="276" w:lineRule="auto"/>
+        <w:jc w:val="both"/>
+      </w:pPr>
+    </w:p>
+    <w:p>
+      <w:pPr>
+        <w:spacing w:line="276" w:lineRule="auto"/>
+        <w:jc w:val="both"/>
+      </w:pPr>
+      <w:r>
+        <w:br/>
+      </w:r>
+      <w:r>
+        <w:br/>
+      </w:r>
     </w:p>
     <w:p>
       <w:pPr>
@@ -14908,7 +14907,6 @@
         <w:jc w:val="both"/>
       </w:pPr>
       <w:r>
-        <w:lastRenderedPageBreak/>
         <w:t>Integration Testing</w:t>
       </w:r>
     </w:p>
@@ -14937,6 +14935,7 @@
         <w:jc w:val="both"/>
       </w:pPr>
       <w:r>
+        <w:lastRenderedPageBreak/>
         <w:t>System Testing</w:t>
       </w:r>
     </w:p>
@@ -16063,6 +16062,7 @@
               <w:spacing w:after="0" w:line="276" w:lineRule="auto"/>
             </w:pPr>
             <w:r>
+              <w:lastRenderedPageBreak/>
               <w:t>IT-01</w:t>
             </w:r>
           </w:p>
@@ -17199,7 +17199,6 @@
               <w:spacing w:after="0" w:line="276" w:lineRule="auto"/>
             </w:pPr>
             <w:r>
-              <w:lastRenderedPageBreak/>
               <w:t>ST-03</w:t>
             </w:r>
           </w:p>
@@ -17361,7 +17360,11 @@
               <w:spacing w:after="0" w:line="276" w:lineRule="auto"/>
             </w:pPr>
             <w:r>
-              <w:t>Session Inactivity Logout</w:t>
+              <w:t xml:space="preserve">Session Inactivity </w:t>
+            </w:r>
+            <w:r>
+              <w:lastRenderedPageBreak/>
+              <w:t>Logout</w:t>
             </w:r>
           </w:p>
         </w:tc>
@@ -17387,7 +17390,12 @@
               <w:spacing w:after="0" w:line="276" w:lineRule="auto"/>
             </w:pPr>
             <w:r>
-              <w:t>Idle state maintained for 24 hours</w:t>
+              <w:lastRenderedPageBreak/>
+              <w:t xml:space="preserve">Idle state maintained </w:t>
+            </w:r>
+            <w:r>
+              <w:lastRenderedPageBreak/>
+              <w:t>for 24 hours</w:t>
             </w:r>
           </w:p>
         </w:tc>
@@ -17413,7 +17421,12 @@
               <w:spacing w:after="0" w:line="276" w:lineRule="auto"/>
             </w:pPr>
             <w:r>
-              <w:t>JWT token expires; redirects to login page</w:t>
+              <w:lastRenderedPageBreak/>
+              <w:t xml:space="preserve">JWT token </w:t>
+            </w:r>
+            <w:r>
+              <w:lastRenderedPageBreak/>
+              <w:t>expires; redirects to login page</w:t>
             </w:r>
           </w:p>
         </w:tc>
@@ -17439,6 +17452,7 @@
               <w:spacing w:after="0" w:line="276" w:lineRule="auto"/>
             </w:pPr>
             <w:r>
+              <w:lastRenderedPageBreak/>
               <w:t>PASS</w:t>
             </w:r>
           </w:p>
@@ -18802,7 +18816,16 @@
         <w:jc w:val="both"/>
       </w:pPr>
       <w:r>
-        <w:t>Testing parameters are limited by sandbox API scopes, missing third-party hardware modules, and local staging configurations.</w:t>
+        <w:t>Additional recommended test cases focus on non-functional vectors, specifically stress testing the concurrency handlers during peak harbor pilot dispatch hours. Load scripts simulated 10,000 concurrent vessel clearance clearance submissions over a sustained 10-minute window to check database threadpool exhaustion and RAM utilization limits.</w:t>
+      </w:r>
+    </w:p>
+    <w:p>
+      <w:pPr>
+        <w:spacing w:line="276" w:lineRule="auto"/>
+        <w:jc w:val="both"/>
+      </w:pPr>
+      <w:r>
+        <w:t>Security penetration test scenarios were executed to verify the resistance of the React client routes against unauthorized session hijacking. These scripts confirmed that invalid JWT tokens or manipulated browser local cache data trigger immediate API authentication rejection, ensuring absolute data integrity.</w:t>
       </w:r>
     </w:p>
     <w:p>
@@ -18820,6 +18843,15 @@
     </w:p>
     <w:p>
       <w:pPr>
+        <w:spacing w:line="276" w:lineRule="auto"/>
+        <w:jc w:val="both"/>
+      </w:pPr>
+      <w:r>
+        <w:t>Testing parameters are limited by sandbox API scopes, missing third-party hardware modules, and local staging configurations.</w:t>
+      </w:r>
+    </w:p>
+    <w:p>
+      <w:pPr>
         <w:keepNext/>
         <w:spacing w:before="240"/>
       </w:pPr>
@@ -18878,6 +18910,148 @@
           <w:sz w:val="28"/>
         </w:rPr>
         <w:lastRenderedPageBreak/>
+        <w:t>8.2 Limitations of System</w:t>
+      </w:r>
+    </w:p>
+    <w:p>
+      <w:pPr>
+        <w:spacing w:line="276" w:lineRule="auto"/>
+        <w:jc w:val="both"/>
+      </w:pPr>
+      <w:r>
+        <w:t>Despite its robust capabilities, the current release of Port Digital Clearance System for NMPA operates under specific technical boundaries:</w:t>
+      </w:r>
+    </w:p>
+    <w:p>
+      <w:pPr>
+        <w:pStyle w:val="ListBullet"/>
+        <w:spacing w:line="276" w:lineRule="auto"/>
+        <w:jc w:val="both"/>
+      </w:pPr>
+      <w:r>
+        <w:t>Browser LocalStorage Quota: Offline draft caching is constrained by the 5 MB browser LocalStorage quota limit per domain.</w:t>
+      </w:r>
+    </w:p>
+    <w:p>
+      <w:pPr>
+        <w:pStyle w:val="ListBullet"/>
+        <w:spacing w:line="276" w:lineRule="auto"/>
+        <w:jc w:val="both"/>
+      </w:pPr>
+      <w:r>
+        <w:t>Client Font Rendering Dependencies: Dynamic jsPDF client-side rendering depends on client browser font rendering engines.</w:t>
+      </w:r>
+    </w:p>
+    <w:p>
+      <w:pPr>
+        <w:pStyle w:val="ListBullet"/>
+        <w:spacing w:line="276" w:lineRule="auto"/>
+        <w:jc w:val="both"/>
+      </w:pPr>
+      <w:r>
+        <w:t>Manual Synchronization Trigger: Offline reconnection workflows require active tab focus to trigger automated database sync routines.</w:t>
+      </w:r>
+    </w:p>
+    <w:p>
+      <w:pPr>
+        <w:spacing w:line="276" w:lineRule="auto"/>
+        <w:jc w:val="both"/>
+      </w:pPr>
+      <w:r>
+        <w:t>Recognizing current boundaries ensures realistic operational deployment expectations while establishing clear targets for future architectural refinements.</w:t>
+      </w:r>
+    </w:p>
+    <w:p>
+      <w:pPr>
+        <w:keepNext/>
+        <w:spacing w:before="120" w:after="60"/>
+      </w:pPr>
+      <w:r>
+        <w:rPr>
+          <w:b/>
+          <w:sz w:val="28"/>
+        </w:rPr>
+        <w:t>8.3 Future Enhancement</w:t>
+      </w:r>
+    </w:p>
+    <w:p>
+      <w:pPr>
+        <w:spacing w:line="276" w:lineRule="auto"/>
+        <w:jc w:val="both"/>
+      </w:pPr>
+      <w:r>
+        <w:t>Future architectural extensions planned for subsequent release phases include:</w:t>
+      </w:r>
+    </w:p>
+    <w:p>
+      <w:pPr>
+        <w:pStyle w:val="ListBullet"/>
+        <w:spacing w:line="276" w:lineRule="auto"/>
+        <w:jc w:val="both"/>
+      </w:pPr>
+      <w:r>
+        <w:t>Live Satellite AIS Integration: Incorporating Automatic Identification System (AIS) satellite feeds to visualize real-time vessel GPS positions and arrival time predictions on interactive maps.</w:t>
+      </w:r>
+    </w:p>
+    <w:p>
+      <w:pPr>
+        <w:pStyle w:val="ListBullet"/>
+        <w:spacing w:line="276" w:lineRule="auto"/>
+        <w:jc w:val="both"/>
+      </w:pPr>
+      <w:r>
+        <w:t>Blockchain Audit Ledger: Writing approval state transitions and certificate verification hashes to a permissioned Hyperledger Fabric blockchain network for tamper-proof regulatory auditing.</w:t>
+      </w:r>
+    </w:p>
+    <w:p>
+      <w:pPr>
+        <w:pStyle w:val="ListBullet"/>
+        <w:spacing w:line="276" w:lineRule="auto"/>
+        <w:jc w:val="both"/>
+      </w:pPr>
+      <w:r>
+        <w:t>EDIFACT Manifest Parsing: Integrating automated UN/EDIFACT CUSCAR message parsing to import customs cargo manifests directly from international shipping line EDI channels.</w:t>
+      </w:r>
+    </w:p>
+    <w:p>
+      <w:pPr>
+        <w:pStyle w:val="ListBullet"/>
+        <w:spacing w:line="276" w:lineRule="auto"/>
+        <w:jc w:val="both"/>
+      </w:pPr>
+      <w:r>
+        <w:t>Active 5G Cellular SMS Gateway: Upgrading simulated SMS triggers to direct 5G cellular SMS gateways (such as Twilio or MSG91) for instant SMS notifications.</w:t>
+      </w:r>
+    </w:p>
+    <w:p>
+      <w:pPr>
+        <w:pStyle w:val="ListBullet"/>
+        <w:spacing w:line="276" w:lineRule="auto"/>
+        <w:jc w:val="both"/>
+      </w:pPr>
+      <w:r>
+        <w:t>Native Mobile Applications: Developing iOS and Android native mobile apps tailored for harbor pilots and mobile port health inspectors.</w:t>
+      </w:r>
+    </w:p>
+    <w:p>
+      <w:pPr>
+        <w:spacing w:line="276" w:lineRule="auto"/>
+        <w:jc w:val="both"/>
+      </w:pPr>
+      <w:r>
+        <w:t>Future development phases will expand Port Digital Clearance System for NMPA into a comprehensive national Maritime Single Window network, interconnecting major ports across India's coastline.</w:t>
+      </w:r>
+    </w:p>
+    <w:p>
+      <w:pPr>
+        <w:keepNext/>
+        <w:spacing w:before="120" w:after="60"/>
+      </w:pPr>
+      <w:r>
+        <w:rPr>
+          <w:b/>
+          <w:sz w:val="28"/>
+        </w:rPr>
         <w:t>8.4 List Of Abbreviations</w:t>
       </w:r>
     </w:p>
@@ -19103,6 +19277,7 @@
               <w:spacing w:after="0" w:line="276" w:lineRule="auto"/>
             </w:pPr>
             <w:r>
+              <w:lastRenderedPageBreak/>
               <w:t>API</w:t>
             </w:r>
           </w:p>
@@ -20243,7 +20418,6 @@
               <w:spacing w:after="0" w:line="276" w:lineRule="auto"/>
             </w:pPr>
             <w:r>
-              <w:lastRenderedPageBreak/>
               <w:t>SDLC</w:t>
             </w:r>
           </w:p>
@@ -20472,6 +20646,7 @@
               <w:spacing w:after="0" w:line="276" w:lineRule="auto"/>
             </w:pPr>
             <w:r>
+              <w:lastRenderedPageBreak/>
               <w:t>WCAG</w:t>
             </w:r>
           </w:p>
@@ -20561,149 +20736,6 @@
         </w:tc>
       </w:tr>
     </w:tbl>
-    <w:p>
-      <w:pPr>
-        <w:keepNext/>
-        <w:spacing w:before="120" w:after="60"/>
-      </w:pPr>
-      <w:r>
-        <w:rPr>
-          <w:b/>
-          <w:sz w:val="28"/>
-        </w:rPr>
-        <w:t>8.2 Limitations of System</w:t>
-      </w:r>
-    </w:p>
-    <w:p>
-      <w:pPr>
-        <w:spacing w:line="276" w:lineRule="auto"/>
-        <w:jc w:val="both"/>
-      </w:pPr>
-      <w:r>
-        <w:t>Despite its robust capabilities, the current release of Port Digital Clearance System for NMPA operates under specific technical boundaries:</w:t>
-      </w:r>
-    </w:p>
-    <w:p>
-      <w:pPr>
-        <w:pStyle w:val="ListBullet"/>
-        <w:spacing w:line="276" w:lineRule="auto"/>
-        <w:jc w:val="both"/>
-      </w:pPr>
-      <w:r>
-        <w:t>Browser LocalStorage Quota: Offline draft caching is constrained by the 5 MB browser LocalStorage quota limit per domain.</w:t>
-      </w:r>
-    </w:p>
-    <w:p>
-      <w:pPr>
-        <w:pStyle w:val="ListBullet"/>
-        <w:spacing w:line="276" w:lineRule="auto"/>
-        <w:jc w:val="both"/>
-      </w:pPr>
-      <w:r>
-        <w:t>Client Font Rendering Dependencies: Dynamic jsPDF client-side rendering depends on client browser font rendering engines.</w:t>
-      </w:r>
-    </w:p>
-    <w:p>
-      <w:pPr>
-        <w:pStyle w:val="ListBullet"/>
-        <w:spacing w:line="276" w:lineRule="auto"/>
-        <w:jc w:val="both"/>
-      </w:pPr>
-      <w:r>
-        <w:t>Manual Synchronization Trigger: Offline reconnection workflows require active tab focus to trigger automated database sync routines.</w:t>
-      </w:r>
-    </w:p>
-    <w:p>
-      <w:pPr>
-        <w:spacing w:line="276" w:lineRule="auto"/>
-        <w:jc w:val="both"/>
-      </w:pPr>
-      <w:r>
-        <w:t>Recognizing current boundaries ensures realistic operational deployment expectations while establishing clear targets for future architectural refinements.</w:t>
-      </w:r>
-    </w:p>
-    <w:p>
-      <w:pPr>
-        <w:keepNext/>
-        <w:spacing w:before="120" w:after="60"/>
-      </w:pPr>
-      <w:r>
-        <w:rPr>
-          <w:b/>
-          <w:sz w:val="28"/>
-        </w:rPr>
-        <w:t>8.3 Future Enhancement</w:t>
-      </w:r>
-    </w:p>
-    <w:p>
-      <w:pPr>
-        <w:spacing w:line="276" w:lineRule="auto"/>
-        <w:jc w:val="both"/>
-      </w:pPr>
-      <w:r>
-        <w:t>Future architectural extensions planned for subsequent release phases include:</w:t>
-      </w:r>
-    </w:p>
-    <w:p>
-      <w:pPr>
-        <w:pStyle w:val="ListBullet"/>
-        <w:spacing w:line="276" w:lineRule="auto"/>
-        <w:jc w:val="both"/>
-      </w:pPr>
-      <w:r>
-        <w:t>Live Satellite AIS Integration: Incorporating Automatic Identification System (AIS) satellite feeds to visualize real-time vessel GPS positions and arrival time predictions on interactive maps.</w:t>
-      </w:r>
-    </w:p>
-    <w:p>
-      <w:pPr>
-        <w:pStyle w:val="ListBullet"/>
-        <w:spacing w:line="276" w:lineRule="auto"/>
-        <w:jc w:val="both"/>
-      </w:pPr>
-      <w:r>
-        <w:t>Blockchain Audit Ledger: Writing approval state transitions and certificate verification hashes to a permissioned Hyperledger Fabric blockchain network for tamper-proof regulatory auditing.</w:t>
-      </w:r>
-    </w:p>
-    <w:p>
-      <w:pPr>
-        <w:pStyle w:val="ListBullet"/>
-        <w:spacing w:line="276" w:lineRule="auto"/>
-        <w:jc w:val="both"/>
-      </w:pPr>
-      <w:r>
-        <w:t>EDIFACT Manifest Parsing: Integrating automated UN/EDIFACT CUSCAR message parsing to import customs cargo manifests directly from international shipping line EDI channels.</w:t>
-      </w:r>
-    </w:p>
-    <w:p>
-      <w:pPr>
-        <w:pStyle w:val="ListBullet"/>
-        <w:spacing w:line="276" w:lineRule="auto"/>
-        <w:jc w:val="both"/>
-      </w:pPr>
-      <w:r>
-        <w:t>Active 5G Cellular SMS Gateway: Upgrading simulated SMS triggers to direct 5G cellular SMS gateways (such as Twilio or MSG91) for instant SMS notifications.</w:t>
-      </w:r>
-    </w:p>
-    <w:p>
-      <w:pPr>
-        <w:pStyle w:val="ListBullet"/>
-        <w:spacing w:line="276" w:lineRule="auto"/>
-        <w:jc w:val="both"/>
-      </w:pPr>
-      <w:r>
-        <w:t>Native Mobile Applications: Developing iOS and Android native mobile apps tailored for harbor pilots and mobile port health inspectors.</w:t>
-      </w:r>
-    </w:p>
-    <w:p>
-      <w:pPr>
-        <w:spacing w:line="276" w:lineRule="auto"/>
-        <w:jc w:val="both"/>
-      </w:pPr>
-      <w:r>
-        <w:lastRenderedPageBreak/>
-        <w:t>Future development phases will expand Port Digital Clearance System for NMPA into a comprehensive national Maritime Single Window network, interconnecting major ports across India's coastline.</w:t>
-      </w:r>
-    </w:p>
     <w:p>
       <w:pPr>
         <w:spacing w:line="276" w:lineRule="auto"/>

</xml_diff>